<commit_message>
Update author interview document
</commit_message>
<xml_diff>
--- a/assets/Author Interview.docx
+++ b/assets/Author Interview.docx
@@ -167,7 +167,13 @@
     </w:p>
     <w:p>
       <w:r>
-        <w:t xml:space="preserve">There’s a moment deep in the jungle where the rescue team, now joined by a rescued contestant, is rafting through a dangerous river. Tonia, the new addition, says, “I think that’s sweet. Every adventure needs a love story.” That line kind of cracked the novel open for me. </w:t>
+        <w:t>There’s a moment deep in the jungle where the rescue team, now joined by a</w:t>
+      </w:r>
+      <w:r>
+        <w:t>n unexpected female</w:t>
+      </w:r>
+      <w:r>
+        <w:t xml:space="preserve">, is rafting through a dangerous river. Tonia, the new addition, says, “I think that’s sweet. Every adventure needs a love story.” That line kind of cracked the novel open for me. </w:t>
       </w:r>
       <w:r>
         <w:lastRenderedPageBreak/>
@@ -889,6 +895,7 @@
   <w:style w:type="character" w:default="1" w:styleId="DefaultParagraphFont">
     <w:name w:val="Default Paragraph Font"/>
     <w:uiPriority w:val="1"/>
+    <w:semiHidden/>
     <w:unhideWhenUsed/>
   </w:style>
   <w:style w:type="table" w:default="1" w:styleId="TableNormal">

</xml_diff>